<commit_message>
Add Phase 6 native training customization and structured targets
</commit_message>
<xml_diff>
--- a/Life_Strong_Project_Scope_of_Work.docx
+++ b/Life_Strong_Project_Scope_of_Work.docx
@@ -7,6 +7,9 @@
         <w:pStyle w:val="Title"/>
       </w:pPr>
       <w:r>
+        <w:rPr>
+          <w:color w:val="000000"/>
+        </w:rPr>
         <w:t>LIFE STRONG</w:t>
       </w:r>
     </w:p>
@@ -17,7 +20,7 @@
     </w:p>
     <w:p>
       <w:r>
-        <w:t>Baseline version 1.0  •  October 16, 2026  •  iOS-first MVP</w:t>
+        <w:t>Baseline version 1.1  •  October 16, 2026  •  iOS-first MVP with Phase 6 amendment</w:t>
       </w:r>
     </w:p>
     <w:p>
@@ -44,6 +47,7 @@
     <w:p>
       <w:pPr>
         <w:pStyle w:val="ListBullet"/>
+        <w:ind w:right="0"/>
       </w:pPr>
       <w:r>
         <w:t>Provide a fast iOS workflow to select a workout, record sets or timed efforts, and complete a session.</w:t>
@@ -52,6 +56,7 @@
     <w:p>
       <w:pPr>
         <w:pStyle w:val="ListBullet"/>
+        <w:ind w:right="0"/>
       </w:pPr>
       <w:r>
         <w:t>Represent exercises, reusable workout templates, multiweek programs, schedules, and completed sessions as distinct objects.</w:t>
@@ -60,6 +65,7 @@
     <w:p>
       <w:pPr>
         <w:pStyle w:val="ListBullet"/>
+        <w:ind w:right="0"/>
       </w:pPr>
       <w:r>
         <w:t>Track resistance, repetitions, duration, distance, and rest without changing historical records when templates are edited.</w:t>
@@ -68,6 +74,7 @@
     <w:p>
       <w:pPr>
         <w:pStyle w:val="ListBullet"/>
+        <w:ind w:right="0"/>
       </w:pPr>
       <w:r>
         <w:t>Support workout reminders, rest timers, exercise history, and basic progress metrics.</w:t>
@@ -76,6 +83,7 @@
     <w:p>
       <w:pPr>
         <w:pStyle w:val="ListBullet"/>
+        <w:ind w:right="0"/>
       </w:pPr>
       <w:r>
         <w:t>Retain the TypeScript + React Native/Expo + Express + PostgreSQL architecture used in Fill My Cup.</w:t>
@@ -853,6 +861,7 @@
     <w:p>
       <w:pPr>
         <w:pStyle w:val="ListBullet"/>
+        <w:ind w:right="0"/>
       </w:pPr>
       <w:r>
         <w:t>Phase 1–2: local-development-only, single-user configuration; do not expose the API publicly.</w:t>
@@ -861,6 +870,7 @@
     <w:p>
       <w:pPr>
         <w:pStyle w:val="ListBullet"/>
+        <w:ind w:right="0"/>
       </w:pPr>
       <w:r>
         <w:t>Before public release: authenticated users, per-user authorization for all data operations, HTTPS, secure secret storage, and least-privilege database access.</w:t>
@@ -869,6 +879,7 @@
     <w:p>
       <w:pPr>
         <w:pStyle w:val="ListBullet"/>
+        <w:ind w:right="0"/>
       </w:pPr>
       <w:r>
         <w:t>Use separate Docker volumes/databases for Life Strong and Fill My Cup; preserve migration history and database backups.</w:t>
@@ -877,6 +888,7 @@
     <w:p>
       <w:pPr>
         <w:pStyle w:val="ListBullet"/>
+        <w:ind w:right="0"/>
       </w:pPr>
       <w:r>
         <w:t>Schedule local notifications only after permission; allow reminders to be disabled.</w:t>
@@ -885,6 +897,7 @@
     <w:p>
       <w:pPr>
         <w:pStyle w:val="ListBullet"/>
+        <w:ind w:right="0"/>
       </w:pPr>
       <w:r>
         <w:t>Store completed sessions independent of evolving program templates; support controlled corrections and audit-relevant timestamps.</w:t>
@@ -969,7 +982,7 @@
           </w:tcPr>
           <w:p>
             <w:r>
-              <w:t>App loads on iPhone; API and DB reachable; backend tests pass. Reported complete.</w:t>
+              <w:t>App loads on iPhone; API and DB reachable; backend tests pass. Accepted October 16, 2026.</w:t>
             </w:r>
           </w:p>
         </w:tc>
@@ -1001,7 +1014,7 @@
           </w:tcPr>
           <w:p>
             <w:r>
-              <w:t>Migrate and seed; CRUD/read APIs behave; record/retrieve/complete session; basic iOS browse screen. Generated package, integration pending.</w:t>
+              <w:t>Migrate and seed; CRUD/read APIs behave; record/retrieve/complete session; basic iOS browse screen. Accepted October 16, 2026.</w:t>
             </w:r>
           </w:p>
         </w:tc>
@@ -1102,6 +1115,38 @@
           </w:p>
         </w:tc>
       </w:tr>
+      <w:tr>
+        <w:tc>
+          <w:tcPr>
+            <w:tcW w:type="dxa" w:w="3293"/>
+          </w:tcPr>
+          <w:p>
+            <w:r>
+              <w:t>6 — Training customization</w:t>
+            </w:r>
+          </w:p>
+        </w:tc>
+        <w:tc>
+          <w:tcPr>
+            <w:tcW w:type="dxa" w:w="3293"/>
+          </w:tcPr>
+          <w:p>
+            <w:r>
+              <w:t>Native exercise, workout and program editors; structured targets; history preservation.</w:t>
+            </w:r>
+          </w:p>
+        </w:tc>
+        <w:tc>
+          <w:tcPr>
+            <w:tcW w:type="dxa" w:w="3293"/>
+          </w:tcPr>
+          <w:p>
+            <w:r>
+              <w:t>Customize and run a workout entirely on iPhone; pass Gate 6 tests in section 15.</w:t>
+            </w:r>
+          </w:p>
+        </w:tc>
+      </w:tr>
     </w:tbl>
     <w:p>
       <w:pPr>
@@ -1127,6 +1172,7 @@
     <w:p>
       <w:pPr>
         <w:pStyle w:val="ListBullet"/>
+        <w:ind w:right="0"/>
       </w:pPr>
       <w:r>
         <w:t>Development targets an Apple Silicon Mac and iPhone using Expo Go; simulator and store delivery can be added later.</w:t>
@@ -1135,6 +1181,7 @@
     <w:p>
       <w:pPr>
         <w:pStyle w:val="ListBullet"/>
+        <w:ind w:right="0"/>
       </w:pPr>
       <w:r>
         <w:t>The existing PostgreSQL host port may already be used by Fill My Cup; Life Strong must maintain isolated container/volume and port mapping.</w:t>
@@ -1143,6 +1190,7 @@
     <w:p>
       <w:pPr>
         <w:pStyle w:val="ListBullet"/>
+        <w:ind w:right="0"/>
       </w:pPr>
       <w:r>
         <w:t>Exercise prescription and user performance are different data objects; changing a plan must never overwrite completed work.</w:t>
@@ -1151,6 +1199,7 @@
     <w:p>
       <w:pPr>
         <w:pStyle w:val="ListBullet"/>
+        <w:ind w:right="0"/>
       </w:pPr>
       <w:r>
         <w:t>Native and Expo packages must be selected using the SDK 57 compatibility matrix, rather than updated independently.</w:t>
@@ -1159,9 +1208,10 @@
     <w:p>
       <w:pPr>
         <w:pStyle w:val="ListBullet"/>
+        <w:ind w:right="0"/>
       </w:pPr>
       <w:r>
-        <w:t>Phase 2 code was packaged, but its actual database/API/iPhone acceptance tests require execution on the local development environment.</w:t>
+        <w:t>Gates 1 through 5 are accepted for local use. Phase 6 and the private release checklist require their own acceptance.</w:t>
       </w:r>
     </w:p>
     <w:p>
@@ -1175,6 +1225,143 @@
     <w:p>
       <w:r>
         <w:t>Scope changes are documented in the repository docs and implemented through versioned source changes and database migrations. A phase is complete only when its defined acceptance tests pass locally, documentation is updated, and the working application can be restored from source and database backups.</w:t>
+      </w:r>
+    </w:p>
+    <w:p>
+      <w:r>
+        <w:br w:type="page"/>
+      </w:r>
+    </w:p>
+    <w:p>
+      <w:pPr>
+        <w:pStyle w:val="Heading1"/>
+      </w:pPr>
+      <w:r>
+        <w:t>15 Phase 6 Training Customization</w:t>
+      </w:r>
+    </w:p>
+    <w:p>
+      <w:r>
+        <w:t>Approved October 16, 2026. Before release, Life Strong will allow the private owner to build and maintain training directly on the iPhone. Gates 1 through 5 remain accepted for local use. Phase 6 adds a separate acceptance gate and does not authorize cloud deployment or App Store submission.</w:t>
+      </w:r>
+    </w:p>
+    <w:p>
+      <w:pPr>
+        <w:pStyle w:val="Heading2"/>
+      </w:pPr>
+      <w:r>
+        <w:t>Exercise and workout editing</w:t>
+      </w:r>
+    </w:p>
+    <w:p>
+      <w:pPr>
+        <w:pStyle w:val="ListBullet"/>
+        <w:ind w:right="0"/>
+      </w:pPr>
+      <w:r>
+        <w:t>Create and edit exercises, including name, equipment, muscle focus and measurement type: repetitions, load with repetitions, duration, or distance with duration.</w:t>
+      </w:r>
+    </w:p>
+    <w:p>
+      <w:pPr>
+        <w:pStyle w:val="ListBullet"/>
+        <w:ind w:right="0"/>
+      </w:pPr>
+      <w:r>
+        <w:t>Create and edit reusable workouts. Add, remove and reorder exercises; set optional structured targets for sets, repetitions, load in kilograms, duration in seconds and distance in meters, with rest in seconds and optional instruction text.</w:t>
+      </w:r>
+    </w:p>
+    <w:p>
+      <w:pPr>
+        <w:pStyle w:val="ListBullet"/>
+        <w:ind w:right="0"/>
+      </w:pPr>
+      <w:r>
+        <w:t>Show targets separately from actual recorded performance. Targets guide the session without creating completed sets or limiting actual sets. Existing free-text prescriptions remain intact; do not infer structured targets from prose.</w:t>
+      </w:r>
+    </w:p>
+    <w:p>
+      <w:pPr>
+        <w:pStyle w:val="ListBullet"/>
+        <w:ind w:right="0"/>
+      </w:pPr>
+      <w:r>
+        <w:t>Create and edit multiweek programs and week/day workout assignments on the iPhone. Archive exercises, workouts and programs with clear confirmation and safe handling of existing references.</w:t>
+      </w:r>
+    </w:p>
+    <w:p>
+      <w:pPr>
+        <w:pStyle w:val="Heading2"/>
+      </w:pPr>
+      <w:r>
+        <w:t>Data and reliability requirements</w:t>
+      </w:r>
+    </w:p>
+    <w:p>
+      <w:r>
+        <w:t>Use additive migrations and validated authenticated APIs. Snapshot structured targets when starting a session so edits never rewrite active or completed workout observations. Reject incompatible targets when changing exercise measurement type and explain how to resolve them. Library editing requires a connection; retain unsaved form values during failed saves and warn before leaving. Retry saved requests without duplicate creations and reject stale edits. Existing workout offline recovery and operation identifiers must continue to work. Durable offline library authoring is outside this phase.</w:t>
+      </w:r>
+    </w:p>
+    <w:p>
+      <w:pPr>
+        <w:pStyle w:val="Heading2"/>
+      </w:pPr>
+      <w:r>
+        <w:t>Gate 6 acceptance</w:t>
+      </w:r>
+    </w:p>
+    <w:p>
+      <w:pPr>
+        <w:pStyle w:val="ListBullet"/>
+        <w:ind w:right="0"/>
+      </w:pPr>
+      <w:r>
+        <w:t>On iPhone, create all four exercise types, customize their fields and save/reopen them.</w:t>
+      </w:r>
+    </w:p>
+    <w:p>
+      <w:pPr>
+        <w:pStyle w:val="ListBullet"/>
+        <w:ind w:right="0"/>
+      </w:pPr>
+      <w:r>
+        <w:t>Build a workout with multiple exercises, reorder/remove entries, edit target sets/reps/load/duration/distance/rest, and verify targets persist after reopening.</w:t>
+      </w:r>
+    </w:p>
+    <w:p>
+      <w:pPr>
+        <w:pStyle w:val="ListBullet"/>
+        <w:ind w:right="0"/>
+      </w:pPr>
+      <w:r>
+        <w:t>Create a multiweek program, assign workouts to week/day slots, edit it and activate it without manual API calls.</w:t>
+      </w:r>
+    </w:p>
+    <w:p>
+      <w:pPr>
+        <w:pStyle w:val="ListBullet"/>
+        <w:ind w:right="0"/>
+      </w:pPr>
+      <w:r>
+        <w:t>Start and complete a customized workout. Verify planned targets and actual results remain distinct; later exercise/template edits preserve existing session snapshots.</w:t>
+      </w:r>
+    </w:p>
+    <w:p>
+      <w:pPr>
+        <w:pStyle w:val="ListBullet"/>
+        <w:ind w:right="0"/>
+      </w:pPr>
+      <w:r>
+        <w:t>Verify validation, stale-edit protection, failed-save retry, archive safeguards and unsaved-change prompts. Recheck offline workout synchronization and notifications.</w:t>
+      </w:r>
+    </w:p>
+    <w:p>
+      <w:pPr>
+        <w:pStyle w:val="ListBullet"/>
+        <w:ind w:right="0"/>
+      </w:pPr>
+      <w:r>
+        <w:t>Pass automated typechecks, API/database regressions and iOS bundling; document physical iPhone acceptance before marking Gate 6 complete. Release security, dependency, hosting, backup and signing gates remain open.</w:t>
       </w:r>
     </w:p>
     <w:sectPr>
@@ -1196,7 +1383,7 @@
       <w:jc w:val="center"/>
     </w:pPr>
     <w:r>
-      <w:t>Life Strong  •  Scope of Work  •  Version 1.0</w:t>
+      <w:t>Life Strong  •  Scope of Work  •  Version 1.1</w:t>
     </w:r>
   </w:p>
 </w:ftr>
@@ -1914,9 +2101,6 @@
     <w:qFormat/>
     <w:rsid w:val="00FC693F"/>
     <w:pPr>
-      <w:pBdr>
-        <w:bottom w:val="single" w:sz="8" w:space="4" w:color="4F81BD" w:themeColor="accent1"/>
-      </w:pBdr>
       <w:spacing w:after="300" w:line="240" w:lineRule="auto"/>
       <w:contextualSpacing/>
     </w:pPr>

</xml_diff>

<commit_message>
Build Phase 7A native SwiftData foundation and migration handoff
</commit_message>
<xml_diff>
--- a/Life_Strong_Project_Scope_of_Work.docx
+++ b/Life_Strong_Project_Scope_of_Work.docx
@@ -20,7 +20,7 @@
     </w:p>
     <w:p>
       <w:r>
-        <w:t>Baseline version 1.1  •  October 16, 2026  •  iOS-first MVP with Phase 6 amendment</w:t>
+        <w:t>Baseline version 1.2  •  October 17, 2026  •  Native SwiftData and CloudKit migration</w:t>
       </w:r>
     </w:p>
     <w:p>
@@ -33,7 +33,7 @@
     </w:p>
     <w:p>
       <w:r>
-        <w:t>Life Strong is a general-purpose fitness and conditioning application for building and following workout programs, recording performance, tracking progression, and maintaining consistent training habits. It is not tied to a single sport. A 12-week mountain biking off-season program serves as initial seed content, while the application model supports strength, endurance, mobility, and custom programs.</w:t>
+        <w:t>Life Strong is a general-purpose fitness and conditioning application for building and following workout programs, recording performance, tracking progression, and maintaining consistent training habits. It is not tied to a single sport. A 12-week mountain biking off-season program serves as initial seed content, while the application model supports strength, endurance, mobility, and custom programs. The approved target is now a native SwiftUI app using local SwiftData and private CloudKit; AWS integration is deferred. The accepted Expo/API app remains in use until the Phase 7 migration gates pass.</w:t>
       </w:r>
     </w:p>
     <w:p>
@@ -86,12 +86,12 @@
         <w:ind w:right="0"/>
       </w:pPr>
       <w:r>
-        <w:t>Retain the TypeScript + React Native/Expo + Express + PostgreSQL architecture used in Fill My Cup.</w:t>
+        <w:t>Deliver a native SwiftUI app with durable local SwiftData and private CloudKit synchronization; preserve accepted legacy behavior throughout migration.</w:t>
       </w:r>
     </w:p>
     <w:p>
       <w:r>
-        <w:t>MVP success: An iPhone can reach the authenticated API when deployed, load a program, initiate a workout, record and retrieve completed sets, and display workout history. In local development, the same workflow can be verified with a single-user API on a trusted network.</w:t>
+        <w:t>Native success: An iPhone can author programs and workouts, record and retrieve sessions, recover drafts/timers and calculate history/progress without an API or Mac. Training data synchronizes through the owner's private CloudKit database when available, with tested export/restore and account isolation. Legacy Gates 1 through 6 remain the feature-parity baseline.</w:t>
       </w:r>
     </w:p>
     <w:p>
@@ -114,11 +114,17 @@
         <w:gridCol w:w="4939"/>
       </w:tblGrid>
       <w:tr>
+        <w:trPr>
+          <w:tblHeader/>
+        </w:trPr>
         <w:tc>
           <w:tcPr>
             <w:tcW w:type="dxa" w:w="4939"/>
           </w:tcPr>
           <w:p>
+            <w:pPr>
+              <w:keepNext/>
+            </w:pPr>
             <w:r>
               <w:t>Module</w:t>
             </w:r>
@@ -129,6 +135,9 @@
             <w:tcW w:type="dxa" w:w="4939"/>
           </w:tcPr>
           <w:p>
+            <w:pPr>
+              <w:keepNext/>
+            </w:pPr>
             <w:r>
               <w:t>MVP requirements</w:t>
             </w:r>
@@ -262,7 +271,7 @@
           </w:tcPr>
           <w:p>
             <w:r>
-              <w:t>PostgreSQL authoritative store; future offline capture and synchronization via local SQLite.</w:t>
+              <w:t>Durable local SwiftData; private CloudKit synchronization; separate device-local drafts and notifications; verified export/restore.</w:t>
             </w:r>
           </w:p>
         </w:tc>
@@ -301,11 +310,17 @@
         <w:gridCol w:w="4939"/>
       </w:tblGrid>
       <w:tr>
+        <w:trPr>
+          <w:tblHeader/>
+        </w:trPr>
         <w:tc>
           <w:tcPr>
             <w:tcW w:type="dxa" w:w="4939"/>
           </w:tcPr>
           <w:p>
+            <w:pPr>
+              <w:keepNext/>
+            </w:pPr>
             <w:r>
               <w:t>Screen</w:t>
             </w:r>
@@ -316,6 +331,9 @@
             <w:tcW w:type="dxa" w:w="4939"/>
           </w:tcPr>
           <w:p>
+            <w:pPr>
+              <w:keepNext/>
+            </w:pPr>
             <w:r>
               <w:t>Responsibilities</w:t>
             </w:r>
@@ -427,7 +445,7 @@
           </w:tcPr>
           <w:p>
             <w:r>
-              <w:t>Units, reminder schedule, API/session configuration, privacy controls.</w:t>
+              <w:t>Units and reminder preferences, iCloud status, migration/export/restore and private data controls.</w:t>
             </w:r>
           </w:p>
         </w:tc>
@@ -443,12 +461,12 @@
     </w:p>
     <w:p>
       <w:r>
-        <w:t>iOS application (React Native + Expo + TypeScript) → HTTPS JSON REST API (Node.js + Express + TypeScript) → PostgreSQL. The mobile client handles navigation, input, local timer behavior, and iOS notifications. The API applies validation and workout business rules, mediates all database access, and later enforces authorization. PostgreSQL remains the system of record.</w:t>
+        <w:t>Approved architecture: SwiftUI screens call Swift domain services and repositories that explicitly save to local SwiftData. Training data synchronizes asynchronously through the owner's private CloudKit database. Device-only drafts, timers and reminder preferences remain separate; UserNotifications schedules local alerts. No dedicated API hosting or app-owned server login is planned for the native target.</w:t>
       </w:r>
     </w:p>
     <w:p>
       <w:r>
-        <w:t>Local development runs Express on the Mac and PostgreSQL in an isolated Docker Compose container. Expo Go connects over the trusted local network. Production deployment will require HTTPS, authentication, secrets management, backups, and hosting decisions before public access.</w:t>
+        <w:t>The existing Expo, Express and PostgreSQL implementation remains the accepted legacy baseline during migration. Preserve its source, database and device state until native import, parity, sync and recovery acceptance. AWS setup and API DNS work are deferred; no resources or account changes are performed by this scope amendment.</w:t>
       </w:r>
     </w:p>
     <w:p>
@@ -472,11 +490,17 @@
         <w:gridCol w:w="3293"/>
       </w:tblGrid>
       <w:tr>
+        <w:trPr>
+          <w:tblHeader/>
+        </w:trPr>
         <w:tc>
           <w:tcPr>
             <w:tcW w:type="dxa" w:w="3293"/>
           </w:tcPr>
           <w:p>
+            <w:pPr>
+              <w:keepNext/>
+            </w:pPr>
             <w:r>
               <w:t>Layer</w:t>
             </w:r>
@@ -487,6 +511,9 @@
             <w:tcW w:type="dxa" w:w="3293"/>
           </w:tcPr>
           <w:p>
+            <w:pPr>
+              <w:keepNext/>
+            </w:pPr>
             <w:r>
               <w:t>Selected technology</w:t>
             </w:r>
@@ -497,6 +524,9 @@
             <w:tcW w:type="dxa" w:w="3293"/>
           </w:tcPr>
           <w:p>
+            <w:pPr>
+              <w:keepNext/>
+            </w:pPr>
             <w:r>
               <w:t>Role</w:t>
             </w:r>
@@ -510,7 +540,7 @@
           </w:tcPr>
           <w:p>
             <w:r>
-              <w:t>iOS frontend</w:t>
+              <w:t>iOS interface</w:t>
             </w:r>
           </w:p>
         </w:tc>
@@ -520,7 +550,7 @@
           </w:tcPr>
           <w:p>
             <w:r>
-              <w:t>React Native, Expo SDK 57, TypeScript</w:t>
+              <w:t>Swift and SwiftUI</w:t>
             </w:r>
           </w:p>
         </w:tc>
@@ -530,7 +560,7 @@
           </w:tcPr>
           <w:p>
             <w:r>
-              <w:t>Native mobile screens and build workflow.</w:t>
+              <w:t>Native iPhone screens and interaction.</w:t>
             </w:r>
           </w:p>
         </w:tc>
@@ -542,7 +572,7 @@
           </w:tcPr>
           <w:p>
             <w:r>
-              <w:t>Routing/navigation</w:t>
+              <w:t>Persistence</w:t>
             </w:r>
           </w:p>
         </w:tc>
@@ -552,7 +582,7 @@
           </w:tcPr>
           <w:p>
             <w:r>
-              <w:t>Expo Router</w:t>
+              <w:t>SwiftData</w:t>
             </w:r>
           </w:p>
         </w:tc>
@@ -562,7 +592,7 @@
           </w:tcPr>
           <w:p>
             <w:r>
-              <w:t>File-based navigation.</w:t>
+              <w:t>Durable local training store with explicit saves.</w:t>
             </w:r>
           </w:p>
         </w:tc>
@@ -574,7 +604,7 @@
           </w:tcPr>
           <w:p>
             <w:r>
-              <w:t>Backend</w:t>
+              <w:t>Synchronization</w:t>
             </w:r>
           </w:p>
         </w:tc>
@@ -584,7 +614,7 @@
           </w:tcPr>
           <w:p>
             <w:r>
-              <w:t>Node.js, Express, TypeScript</w:t>
+              <w:t>Private CloudKit</w:t>
             </w:r>
           </w:p>
         </w:tc>
@@ -594,7 +624,7 @@
           </w:tcPr>
           <w:p>
             <w:r>
-              <w:t>REST endpoints and services.</w:t>
+              <w:t>Owner iCloud synchronization without a hosted API.</w:t>
             </w:r>
           </w:p>
         </w:tc>
@@ -606,7 +636,7 @@
           </w:tcPr>
           <w:p>
             <w:r>
-              <w:t>Database</w:t>
+              <w:t>Domain services</w:t>
             </w:r>
           </w:p>
         </w:tc>
@@ -616,7 +646,7 @@
           </w:tcPr>
           <w:p>
             <w:r>
-              <w:t>PostgreSQL</w:t>
+              <w:t>Swift and Foundation</w:t>
             </w:r>
           </w:p>
         </w:tc>
@@ -626,71 +656,7 @@
           </w:tcPr>
           <w:p>
             <w:r>
-              <w:t>Relational authoritative storage.</w:t>
-            </w:r>
-          </w:p>
-        </w:tc>
-      </w:tr>
-      <w:tr>
-        <w:tc>
-          <w:tcPr>
-            <w:tcW w:type="dxa" w:w="3293"/>
-          </w:tcPr>
-          <w:p>
-            <w:r>
-              <w:t>Database access</w:t>
-            </w:r>
-          </w:p>
-        </w:tc>
-        <w:tc>
-          <w:tcPr>
-            <w:tcW w:type="dxa" w:w="3293"/>
-          </w:tcPr>
-          <w:p>
-            <w:r>
-              <w:t>pg and SQL migration scripts</w:t>
-            </w:r>
-          </w:p>
-        </w:tc>
-        <w:tc>
-          <w:tcPr>
-            <w:tcW w:type="dxa" w:w="3293"/>
-          </w:tcPr>
-          <w:p>
-            <w:r>
-              <w:t>Parameterized queries and schema changes.</w:t>
-            </w:r>
-          </w:p>
-        </w:tc>
-      </w:tr>
-      <w:tr>
-        <w:tc>
-          <w:tcPr>
-            <w:tcW w:type="dxa" w:w="3293"/>
-          </w:tcPr>
-          <w:p>
-            <w:r>
-              <w:t>Validation</w:t>
-            </w:r>
-          </w:p>
-        </w:tc>
-        <w:tc>
-          <w:tcPr>
-            <w:tcW w:type="dxa" w:w="3293"/>
-          </w:tcPr>
-          <w:p>
-            <w:r>
-              <w:t>Zod</w:t>
-            </w:r>
-          </w:p>
-        </w:tc>
-        <w:tc>
-          <w:tcPr>
-            <w:tcW w:type="dxa" w:w="3293"/>
-          </w:tcPr>
-          <w:p>
-            <w:r>
-              <w:t>Runtime request/response schema checks.</w:t>
+              <w:t>Validation, snapshots, calendar logic and analytics.</w:t>
             </w:r>
           </w:p>
         </w:tc>
@@ -712,7 +678,7 @@
           </w:tcPr>
           <w:p>
             <w:r>
-              <w:t>expo-notifications</w:t>
+              <w:t>UserNotifications</w:t>
             </w:r>
           </w:p>
         </w:tc>
@@ -722,7 +688,7 @@
           </w:tcPr>
           <w:p>
             <w:r>
-              <w:t>On-device scheduled reminders and rest alerts.</w:t>
+              <w:t>Permission-based device-local reminders and rest alerts.</w:t>
             </w:r>
           </w:p>
         </w:tc>
@@ -734,7 +700,7 @@
           </w:tcPr>
           <w:p>
             <w:r>
-              <w:t>Offline (planned)</w:t>
+              <w:t>Recovery</w:t>
             </w:r>
           </w:p>
         </w:tc>
@@ -744,7 +710,7 @@
           </w:tcPr>
           <w:p>
             <w:r>
-              <w:t>Expo SQLite</w:t>
+              <w:t>Versioned JSON exports</w:t>
             </w:r>
           </w:p>
         </w:tc>
@@ -754,7 +720,7 @@
           </w:tcPr>
           <w:p>
             <w:r>
-              <w:t>Local drafts and later sync queue.</w:t>
+              <w:t>Validated import, provenance and independent restore.</w:t>
             </w:r>
           </w:p>
         </w:tc>
@@ -776,7 +742,7 @@
           </w:tcPr>
           <w:p>
             <w:r>
-              <w:t>Docker Compose, npm, Git, VS Code</w:t>
+              <w:t>Xcode and Git</w:t>
             </w:r>
           </w:p>
         </w:tc>
@@ -786,7 +752,7 @@
           </w:tcPr>
           <w:p>
             <w:r>
-              <w:t>Reproducible local setup and source control.</w:t>
+              <w:t>Signed native build, source control and versioned schemas.</w:t>
             </w:r>
           </w:p>
         </w:tc>
@@ -808,7 +774,7 @@
           </w:tcPr>
           <w:p>
             <w:r>
-              <w:t>TypeScript, Node test runner/Supertest or Vitest</w:t>
+              <w:t>Native unit and UI tests</w:t>
             </w:r>
           </w:p>
         </w:tc>
@@ -818,7 +784,39 @@
           </w:tcPr>
           <w:p>
             <w:r>
-              <w:t>Type and API behavior verification.</w:t>
+              <w:t>Import, offline, sync, accessibility and parity evidence.</w:t>
+            </w:r>
+          </w:p>
+        </w:tc>
+      </w:tr>
+      <w:tr>
+        <w:tc>
+          <w:tcPr>
+            <w:tcW w:type="dxa" w:w="3293"/>
+          </w:tcPr>
+          <w:p>
+            <w:r>
+              <w:t>Legacy baseline</w:t>
+            </w:r>
+          </w:p>
+        </w:tc>
+        <w:tc>
+          <w:tcPr>
+            <w:tcW w:type="dxa" w:w="3293"/>
+          </w:tcPr>
+          <w:p>
+            <w:r>
+              <w:t>Expo Express PostgreSQL</w:t>
+            </w:r>
+          </w:p>
+        </w:tc>
+        <w:tc>
+          <w:tcPr>
+            <w:tcW w:type="dxa" w:w="3293"/>
+          </w:tcPr>
+          <w:p>
+            <w:r>
+              <w:t>Retained until native cutover and recovery acceptance.</w:t>
             </w:r>
           </w:p>
         </w:tc>
@@ -834,7 +832,7 @@
     </w:p>
     <w:p>
       <w:r>
-        <w:t>Primary entities: users (future authenticated identity), exercises, workout_templates, template_exercises, programs, program_weeks/program_schedule, user_programs, workout_sessions, session_exercises, exercise_sets, reminder_preferences. Template associations define intended training; session records are immutable historical observations except for explicit corrections. Exercises support measurement-specific values; weight is stored canonically in kilograms and converted for display.</w:t>
+        <w:t>Native entities include Exercise, WorkoutTemplate, TemplateExercise, TrainingProgram, ProgramSlot, ProgramEnrollment, WorkoutSession, SessionExercise and RecordedSet, plus correction/import audit and device-local recovery models. Preserve original domain UUIDs, archive flags, ordering, nullable targets, actual metric values and independent session snapshots. Use versioned SwiftData schemas and application validation compatible with private CloudKit.</w:t>
       </w:r>
     </w:p>
     <w:p>
@@ -842,12 +840,12 @@
         <w:pStyle w:val="Heading1"/>
       </w:pPr>
       <w:r>
-        <w:t>9. API Design Principles</w:t>
+        <w:t>9. Native Data and Legacy API Principles</w:t>
       </w:r>
     </w:p>
     <w:p>
       <w:r>
-        <w:t>Version REST endpoints under /api/v1. Resource groups include /exercises, /workout-templates, /programs, /schedule, /sessions, /progress, /preferences, and /health. Validate payloads, use parameterized SQL, distinguish 4xx validation from 5xx server faults, and return stable JSON error shapes. Provide idempotency keys/client-generated operation IDs for eventual offline retries.</w:t>
+        <w:t>Legacy versioned REST endpoints remain a migration reference. Native training commands replace API calls and validate before explicit durable local saves. Starting a session snapshots intended training; subsequent library edits never rewrite observations. Preserve operation identities for import/retry; verify deduplication and correction conflicts instead of assuming PostgreSQL uniqueness or distributed revision locks carry over to CloudKit.</w:t>
       </w:r>
     </w:p>
     <w:p>
@@ -873,7 +871,7 @@
         <w:ind w:right="0"/>
       </w:pPr>
       <w:r>
-        <w:t>Before public release: authenticated users, per-user authorization for all data operations, HTTPS, secure secret storage, and least-privilege database access.</w:t>
+        <w:t>Before native release: verify Apple signing and iCloud capabilities, private-database/account isolation, device protection, safe export/deletion semantics and independent recovery. Legacy authenticated API safeguards remain while that app is used.</w:t>
       </w:r>
     </w:p>
     <w:p>
@@ -924,11 +922,17 @@
         <w:gridCol w:w="3293"/>
       </w:tblGrid>
       <w:tr>
+        <w:trPr>
+          <w:tblHeader/>
+        </w:trPr>
         <w:tc>
           <w:tcPr>
             <w:tcW w:type="dxa" w:w="3293"/>
           </w:tcPr>
           <w:p>
+            <w:pPr>
+              <w:keepNext/>
+            </w:pPr>
             <w:r>
               <w:t>Phase</w:t>
             </w:r>
@@ -939,6 +943,9 @@
             <w:tcW w:type="dxa" w:w="3293"/>
           </w:tcPr>
           <w:p>
+            <w:pPr>
+              <w:keepNext/>
+            </w:pPr>
             <w:r>
               <w:t>Deliverables</w:t>
             </w:r>
@@ -949,6 +956,9 @@
             <w:tcW w:type="dxa" w:w="3293"/>
           </w:tcPr>
           <w:p>
+            <w:pPr>
+              <w:keepNext/>
+            </w:pPr>
             <w:r>
               <w:t>Exit criteria</w:t>
             </w:r>
@@ -1142,7 +1152,39 @@
           </w:tcPr>
           <w:p>
             <w:r>
-              <w:t>Customize and run a workout entirely on iPhone; pass Gate 6 tests in section 15.</w:t>
+              <w:t>Gate 6 accepted October 17, 2026. Preserve customization in the native rewrite.</w:t>
+            </w:r>
+          </w:p>
+        </w:tc>
+      </w:tr>
+      <w:tr>
+        <w:tc>
+          <w:tcPr>
+            <w:tcW w:type="dxa" w:w="3293"/>
+          </w:tcPr>
+          <w:p>
+            <w:r>
+              <w:t>7 — Native migration</w:t>
+            </w:r>
+          </w:p>
+        </w:tc>
+        <w:tc>
+          <w:tcPr>
+            <w:tcW w:type="dxa" w:w="3293"/>
+          </w:tcPr>
+          <w:p>
+            <w:r>
+              <w:t>SwiftUI, SwiftData, private CloudKit, verified import and feature parity.</w:t>
+            </w:r>
+          </w:p>
+        </w:tc>
+        <w:tc>
+          <w:tcPr>
+            <w:tcW w:type="dxa" w:w="3293"/>
+          </w:tcPr>
+          <w:p>
+            <w:r>
+              <w:t>Pass native gates 7A to 7E and owner acceptance before retiring the legacy app.</w:t>
             </w:r>
           </w:p>
         </w:tc>
@@ -1158,7 +1200,7 @@
     </w:p>
     <w:p>
       <w:r>
-        <w:t>Maintain one evolving life-strong repository; new phase packages are merged into that repository rather than started as separate Compose projects. Preserve local .env files and the validated Expo SDK 57 package manifest/lockfile during merges. Do not commit secrets, node_modules, .expo, or generated build output. Keep migration scripts additive; never run destructive Docker volume commands without a verified database backup.</w:t>
+        <w:t>Maintain this evolving repository and add the native project under ios-native. Preserve the accepted legacy directories, .env files, lockfiles, PostgreSQL volumes and Expo storage throughout migration. Never commit secrets or personal export data. Use additive legacy SQL migrations and versioned native schema migrations. No working data, real cloud schema or Docker volume may be reset merely to retry migration.</w:t>
       </w:r>
     </w:p>
     <w:p>
@@ -1175,7 +1217,7 @@
         <w:ind w:right="0"/>
       </w:pPr>
       <w:r>
-        <w:t>Development targets an Apple Silicon Mac and iPhone using Expo Go; simulator and store delivery can be added later.</w:t>
+        <w:t>Native development targets an Apple Silicon Mac with Xcode and the owner's iPhone. Verify the actual OS/deployment target and Apple team capabilities in Phase 7A. Legacy Expo Go remains available until cutover.</w:t>
       </w:r>
     </w:p>
     <w:p>
@@ -1202,7 +1244,7 @@
         <w:ind w:right="0"/>
       </w:pPr>
       <w:r>
-        <w:t>Native and Expo packages must be selected using the SDK 57 compatibility matrix, rather than updated independently.</w:t>
+        <w:t>Validate the actual Swift/Xcode/SwiftData toolchain and native dependencies. Preserve the accepted Expo dependency set while the legacy app is used; unresolved legacy advisories are not declared fixed by this architecture change.</w:t>
       </w:r>
     </w:p>
     <w:p>
@@ -1211,7 +1253,7 @@
         <w:ind w:right="0"/>
       </w:pPr>
       <w:r>
-        <w:t>Gates 1 through 5 are accepted for local use. Phase 6 and the private release checklist require their own acceptance.</w:t>
+        <w:t>Gates 1 through 6 are accepted for the legacy app, with Gate 6 accepted October 17, 2026. New native migration and signing/recovery gates require separate acceptance.</w:t>
       </w:r>
     </w:p>
     <w:p>
@@ -1228,11 +1270,6 @@
       </w:r>
     </w:p>
     <w:p>
-      <w:r>
-        <w:br w:type="page"/>
-      </w:r>
-    </w:p>
-    <w:p>
       <w:pPr>
         <w:pStyle w:val="Heading1"/>
       </w:pPr>
@@ -1242,7 +1279,7 @@
     </w:p>
     <w:p>
       <w:r>
-        <w:t>Approved October 16, 2026. Before release, Life Strong will allow the private owner to build and maintain training directly on the iPhone. Gates 1 through 5 remain accepted for local use. Phase 6 adds a separate acceptance gate and does not authorize cloud deployment or App Store submission.</w:t>
+        <w:t>Phase 6 was approved October 16, 2026 and accepted October 17, 2026 for the legacy Expo/API app. Its customization features and acceptance checks below are preserved as the native feature-parity baseline. Phase 7 supersedes its server architecture for the final release.</w:t>
       </w:r>
     </w:p>
     <w:p>
@@ -1299,7 +1336,7 @@
     </w:p>
     <w:p>
       <w:r>
-        <w:t>Use additive migrations and validated authenticated APIs. Snapshot structured targets when starting a session so edits never rewrite active or completed workout observations. Reject incompatible targets when changing exercise measurement type and explain how to resolve them. Library editing requires a connection; retain unsaved form values during failed saves and warn before leaving. Retry saved requests without duplicate creations and reject stale edits. Existing workout offline recovery and operation identifiers must continue to work. Durable offline library authoring is outside this phase.</w:t>
+        <w:t>Legacy implementation: use additive migrations and validated authenticated APIs, preserve session snapshots and pending queues, and retain forms during failed library saves. The accepted legacy library editor requires a connection. The Phase 7 native replacement retains validation/history/retry safety and makes library/session creation work from the local store without an API.</w:t>
       </w:r>
     </w:p>
     <w:p>
@@ -1361,7 +1398,96 @@
         <w:ind w:right="0"/>
       </w:pPr>
       <w:r>
-        <w:t>Pass automated typechecks, API/database regressions and iOS bundling; document physical iPhone acceptance before marking Gate 6 complete. Release security, dependency, hosting, backup and signing gates remain open.</w:t>
+        <w:t>Legacy Gate 6 passed automated checks and owner iPhone acceptance. Repeat applicable customization, offline, notification and accessibility behavior in the native implementation before accepting Phase 7.</w:t>
+      </w:r>
+    </w:p>
+    <w:p>
+      <w:r>
+        <w:br w:type="page"/>
+      </w:r>
+    </w:p>
+    <w:p>
+      <w:pPr>
+        <w:pStyle w:val="Heading1"/>
+      </w:pPr>
+      <w:r>
+        <w:t>16 Phase 7 Native Storage and Sync Migration</w:t>
+      </w:r>
+    </w:p>
+    <w:p>
+      <w:r>
+        <w:t>Approved October 17, 2026. AWS integration is deferred. Life Strong will move to SwiftUI, local SwiftData and private CloudKit for one owner. This changes both the interface and persistence architecture. Existing Gates 1 through 6 stay accepted for the legacy implementation; no Swift app or CloudKit deployment is claimed complete by this amendment.</w:t>
+      </w:r>
+    </w:p>
+    <w:p>
+      <w:pPr>
+        <w:pStyle w:val="Heading2"/>
+      </w:pPr>
+      <w:r>
+        <w:t>Delivery sequence</w:t>
+      </w:r>
+    </w:p>
+    <w:p>
+      <w:pPr>
+        <w:pStyle w:val="ListBullet"/>
+      </w:pPr>
+      <w:r>
+        <w:t>7A Prove a versioned native schema, explicit local saves, relaunch recovery and private development-container compatibility using disposable fixtures.</w:t>
+      </w:r>
+    </w:p>
+    <w:p>
+      <w:pPr>
+        <w:pStyle w:val="ListBullet"/>
+      </w:pPr>
+      <w:r>
+        <w:t>7B Build a read-only consistent SQL exporter, explicit Expo device recovery export and repeatable staged SwiftData importer. Preserve UUIDs, archives, targets, actuals, dates and available correction audit; exclude credentials.</w:t>
+      </w:r>
+    </w:p>
+    <w:p>
+      <w:pPr>
+        <w:pStyle w:val="ListBullet"/>
+      </w:pPr>
+      <w:r>
+        <w:t>7C Rebuild accepted library, program, workout, reminder and progress workflows in SwiftUI. New workouts and library edits must work without a Mac, API or network.</w:t>
+      </w:r>
+    </w:p>
+    <w:p>
+      <w:pPr>
+        <w:pStyle w:val="ListBullet"/>
+      </w:pPr>
+      <w:r>
+        <w:t>7D Verify private sync, partial download states, account isolation, quota/network recovery, duplicate protection and independent export/restore. Initially use one designated writing/import device.</w:t>
+      </w:r>
+    </w:p>
+    <w:p>
+      <w:pPr>
+        <w:pStyle w:val="ListBullet"/>
+      </w:pPr>
+      <w:r>
+        <w:t>7E Reconcile legacy queues, freeze writes, capture final verified backups, import once into the intended production environment and obtain native standalone acceptance before retirement.</w:t>
+      </w:r>
+    </w:p>
+    <w:p>
+      <w:pPr>
+        <w:pStyle w:val="Heading2"/>
+      </w:pPr>
+      <w:r>
+        <w:t>Preservation and release requirements</w:t>
+      </w:r>
+    </w:p>
+    <w:p>
+      <w:r>
+        <w:t>Keep the accepted app, PostgreSQL database, Expo storage, source and private configuration intact until native acceptance. Swift cannot directly read Expo Go's sandbox; pending writes, unsaved forms, timers and reminder preferences need an explicit recovery path. Missing or conflicted writes block cutover. Sync is not an independent backup, and local save does not prove cloud delivery.</w:t>
+      </w:r>
+    </w:p>
+    <w:p>
+      <w:r>
+        <w:t>SwiftData and CloudKit models require their own validation and versioned migrations; do not assume SQL uniqueness, foreign keys or server revision locks transfer to distributed sync. Preserve independent session snapshots and explicit corrections. Test account changes without uploading the former owner's local data into another account. No destructive production schema reset is an acceptable recovery method.</w:t>
+      </w:r>
+    </w:p>
+    <w:p>
+      <w:r>
+        <w:t>Use docs/swiftdata-migration-plan.md and docs/data-migration-contract.md as the implementation and data-transfer specifications. Apple signing, private-container capabilities, physical iPhone testing and production schema review remain required. Existing AWS guides are historical fallback material. No cloud resources are created or deleted by this amendment.</w:t>
       </w:r>
     </w:p>
     <w:sectPr>
@@ -1383,7 +1509,7 @@
       <w:jc w:val="center"/>
     </w:pPr>
     <w:r>
-      <w:t>Life Strong  •  Scope of Work  •  Version 1.1</w:t>
+      <w:t>Life Strong  •  Scope of Work  •  Version 1.2</w:t>
     </w:r>
   </w:p>
 </w:ftr>

</xml_diff>